<commit_message>
Fixed typo in instructions where name of folder not change from roboticscamp2025 to aisoccerbot
</commit_message>
<xml_diff>
--- a/SoccerBot 2026 Schedule and Instructions.docx
+++ b/SoccerBot 2026 Schedule and Instructions.docx
@@ -727,21 +727,7 @@
         <w:rPr>
           <w:color w:val="000000"/>
         </w:rPr>
-        <w:t xml:space="preserve">Connect the </w:t>
-      </w:r>
-      <w:proofErr w:type="spellStart"/>
-      <w:r>
-        <w:rPr>
-          <w:color w:val="000000"/>
-        </w:rPr>
-        <w:t>Rpi</w:t>
-      </w:r>
-      <w:proofErr w:type="spellEnd"/>
-      <w:r>
-        <w:rPr>
-          <w:color w:val="000000"/>
-        </w:rPr>
-        <w:t xml:space="preserve"> to monitor </w:t>
+        <w:t xml:space="preserve">Connect the Rpi to monitor </w:t>
       </w:r>
     </w:p>
     <w:p>
@@ -781,19 +767,11 @@
         </w:pBdr>
         <w:spacing w:after="0"/>
       </w:pPr>
-      <w:proofErr w:type="spellStart"/>
-      <w:r>
-        <w:rPr>
-          <w:color w:val="000000"/>
-        </w:rPr>
-        <w:t>Rpi</w:t>
-      </w:r>
-      <w:proofErr w:type="spellEnd"/>
-      <w:r>
-        <w:rPr>
-          <w:color w:val="000000"/>
-        </w:rPr>
-        <w:t xml:space="preserve"> Setup </w:t>
+      <w:r>
+        <w:rPr>
+          <w:color w:val="000000"/>
+        </w:rPr>
+        <w:t xml:space="preserve">Rpi Setup </w:t>
       </w:r>
     </w:p>
     <w:p>
@@ -894,16 +872,8 @@
         <w:rPr>
           <w:color w:val="000000"/>
         </w:rPr>
-        <w:t xml:space="preserve">Connect to </w:t>
-      </w:r>
-      <w:proofErr w:type="spellStart"/>
-      <w:r>
-        <w:rPr>
-          <w:color w:val="000000"/>
-        </w:rPr>
-        <w:t>wifi</w:t>
-      </w:r>
-      <w:proofErr w:type="spellEnd"/>
+        <w:t>Connect to wifi</w:t>
+      </w:r>
     </w:p>
     <w:p>
       <w:pPr>
@@ -968,21 +938,7 @@
         <w:rPr>
           <w:color w:val="000000"/>
         </w:rPr>
-        <w:t>`</w:t>
-      </w:r>
-      <w:proofErr w:type="spellStart"/>
-      <w:r>
-        <w:rPr>
-          <w:color w:val="000000"/>
-        </w:rPr>
-        <w:t>sudo</w:t>
-      </w:r>
-      <w:proofErr w:type="spellEnd"/>
-      <w:r>
-        <w:rPr>
-          <w:color w:val="000000"/>
-        </w:rPr>
-        <w:t xml:space="preserve"> apt update</w:t>
+        <w:t>`sudo apt update</w:t>
       </w:r>
       <w:r>
         <w:rPr>
@@ -1171,21 +1127,7 @@
         <w:rPr>
           <w:color w:val="000000"/>
         </w:rPr>
-        <w:t xml:space="preserve">` </w:t>
-      </w:r>
-      <w:proofErr w:type="spellStart"/>
-      <w:r>
-        <w:rPr>
-          <w:color w:val="000000"/>
-        </w:rPr>
-        <w:t>sudo</w:t>
-      </w:r>
-      <w:proofErr w:type="spellEnd"/>
-      <w:r>
-        <w:rPr>
-          <w:color w:val="000000"/>
-        </w:rPr>
-        <w:t xml:space="preserve"> apt install python3-opencv python3-gpiozero python3-picamera2</w:t>
+        <w:t>` sudo apt install python3-opencv python3-gpiozero python3-picamera2</w:t>
       </w:r>
       <w:r>
         <w:rPr>
@@ -1285,21 +1227,7 @@
         <w:rPr>
           <w:color w:val="000000"/>
         </w:rPr>
-        <w:t>Test with `</w:t>
-      </w:r>
-      <w:proofErr w:type="spellStart"/>
-      <w:r>
-        <w:rPr>
-          <w:color w:val="000000"/>
-        </w:rPr>
-        <w:t>rpicam</w:t>
-      </w:r>
-      <w:proofErr w:type="spellEnd"/>
-      <w:r>
-        <w:rPr>
-          <w:color w:val="000000"/>
-        </w:rPr>
-        <w:t>-hello`</w:t>
+        <w:t>Test with `rpicam-hello`</w:t>
       </w:r>
     </w:p>
     <w:p>
@@ -1365,21 +1293,7 @@
         <w:rPr>
           <w:color w:val="000000"/>
         </w:rPr>
-        <w:t>`</w:t>
-      </w:r>
-      <w:proofErr w:type="spellStart"/>
-      <w:r>
-        <w:rPr>
-          <w:color w:val="000000"/>
-        </w:rPr>
-        <w:t>sudo</w:t>
-      </w:r>
-      <w:proofErr w:type="spellEnd"/>
-      <w:r>
-        <w:rPr>
-          <w:color w:val="000000"/>
-        </w:rPr>
-        <w:t xml:space="preserve"> git clone </w:t>
+        <w:t xml:space="preserve">`sudo git clone </w:t>
       </w:r>
       <w:hyperlink r:id="rId7" w:history="1">
         <w:r>
@@ -1415,7 +1329,19 @@
         <w:rPr>
           <w:color w:val="000000"/>
         </w:rPr>
-        <w:t>`cd roboticscamp2025`</w:t>
+        <w:t xml:space="preserve">`cd </w:t>
+      </w:r>
+      <w:r>
+        <w:rPr>
+          <w:color w:val="000000"/>
+        </w:rPr>
+        <w:t>aisoccerbot</w:t>
+      </w:r>
+      <w:r>
+        <w:rPr>
+          <w:color w:val="000000"/>
+        </w:rPr>
+        <w:t>`</w:t>
       </w:r>
     </w:p>
     <w:p>
@@ -1437,32 +1363,22 @@
         <w:rPr>
           <w:color w:val="000000"/>
         </w:rPr>
-        <w:t>`python green_ball_tracker.py` (</w:t>
-      </w:r>
-      <w:proofErr w:type="spellStart"/>
-      <w:r>
-        <w:rPr>
-          <w:color w:val="000000"/>
-        </w:rPr>
-        <w:t>Reuires</w:t>
-      </w:r>
-      <w:proofErr w:type="spellEnd"/>
-      <w:r>
-        <w:rPr>
-          <w:color w:val="000000"/>
-        </w:rPr>
-        <w:t xml:space="preserve"> </w:t>
-      </w:r>
-      <w:r>
-        <w:t xml:space="preserve">Step </w:t>
-      </w:r>
-      <w:proofErr w:type="spellStart"/>
-      <w:r>
-        <w:t>I.d</w:t>
-      </w:r>
-      <w:proofErr w:type="spellEnd"/>
-      <w:r>
-        <w:t xml:space="preserve"> to be complete)</w:t>
+        <w:t>`python green_ball_tracker.py` (Re</w:t>
+      </w:r>
+      <w:r>
+        <w:rPr>
+          <w:color w:val="000000"/>
+        </w:rPr>
+        <w:t>q</w:t>
+      </w:r>
+      <w:r>
+        <w:rPr>
+          <w:color w:val="000000"/>
+        </w:rPr>
+        <w:t xml:space="preserve">uires </w:t>
+      </w:r>
+      <w:r>
+        <w:t>Step I.d to be complete)</w:t>
       </w:r>
     </w:p>
     <w:p>
@@ -1506,21 +1422,7 @@
         <w:rPr>
           <w:color w:val="000000"/>
         </w:rPr>
-        <w:t xml:space="preserve">Learn about HSV values and how </w:t>
-      </w:r>
-      <w:proofErr w:type="spellStart"/>
-      <w:r>
-        <w:rPr>
-          <w:color w:val="000000"/>
-        </w:rPr>
-        <w:t>opencv</w:t>
-      </w:r>
-      <w:proofErr w:type="spellEnd"/>
-      <w:r>
-        <w:rPr>
-          <w:color w:val="000000"/>
-        </w:rPr>
-        <w:t xml:space="preserve"> tracks colors</w:t>
+        <w:t>Learn about HSV values and how opencv tracks colors</w:t>
       </w:r>
     </w:p>
     <w:p>
@@ -1586,21 +1488,7 @@
         <w:rPr>
           <w:color w:val="000000"/>
         </w:rPr>
-        <w:t>Fabricate the base (See separate “</w:t>
-      </w:r>
-      <w:proofErr w:type="spellStart"/>
-      <w:r>
-        <w:rPr>
-          <w:color w:val="000000"/>
-        </w:rPr>
-        <w:t>SoccerBot</w:t>
-      </w:r>
-      <w:proofErr w:type="spellEnd"/>
-      <w:r>
-        <w:rPr>
-          <w:color w:val="000000"/>
-        </w:rPr>
-        <w:t xml:space="preserve"> Assembly” document)</w:t>
+        <w:t>Fabricate the base (See separate “SoccerBot Assembly” document)</w:t>
       </w:r>
     </w:p>
     <w:p>
@@ -1703,29 +1591,8 @@
         </w:pBdr>
         <w:spacing w:after="0"/>
       </w:pPr>
-      <w:proofErr w:type="spellStart"/>
-      <w:r>
-        <w:t>right_</w:t>
-      </w:r>
-      <w:proofErr w:type="gramStart"/>
-      <w:r>
-        <w:t>motor</w:t>
-      </w:r>
-      <w:proofErr w:type="spellEnd"/>
-      <w:r>
-        <w:t xml:space="preserve">  =</w:t>
-      </w:r>
-      <w:proofErr w:type="gramEnd"/>
-      <w:r>
-        <w:t xml:space="preserve"> </w:t>
-      </w:r>
-      <w:proofErr w:type="gramStart"/>
-      <w:r>
-        <w:t>Motor(</w:t>
-      </w:r>
-      <w:proofErr w:type="gramEnd"/>
-      <w:r>
-        <w:t>forward=17, backward=18)</w:t>
+      <w:r>
+        <w:t>right_motor  = Motor(forward=17, backward=18)</w:t>
       </w:r>
     </w:p>
     <w:p>
@@ -1743,21 +1610,8 @@
         </w:pBdr>
         <w:spacing w:after="0"/>
       </w:pPr>
-      <w:proofErr w:type="spellStart"/>
-      <w:r>
-        <w:t>left_motor</w:t>
-      </w:r>
-      <w:proofErr w:type="spellEnd"/>
-      <w:r>
-        <w:t xml:space="preserve"> = </w:t>
-      </w:r>
-      <w:proofErr w:type="gramStart"/>
-      <w:r>
-        <w:t>Motor(</w:t>
-      </w:r>
-      <w:proofErr w:type="gramEnd"/>
-      <w:r>
-        <w:t>forward=22, backward=23)</w:t>
+      <w:r>
+        <w:t>left_motor = Motor(forward=22, backward=23)</w:t>
       </w:r>
     </w:p>
     <w:p>
@@ -1823,7 +1677,19 @@
         <w:rPr>
           <w:color w:val="000000"/>
         </w:rPr>
-        <w:t>Run soccer_bots.py on startup. Go to crontab section in README.md</w:t>
+        <w:t>Run soccer_bots</w:t>
+      </w:r>
+      <w:r>
+        <w:rPr>
+          <w:color w:val="000000"/>
+        </w:rPr>
+        <w:t>_no_preview</w:t>
+      </w:r>
+      <w:r>
+        <w:rPr>
+          <w:color w:val="000000"/>
+        </w:rPr>
+        <w:t>.py on startup. Go to crontab section in README.md</w:t>
       </w:r>
     </w:p>
     <w:p>
@@ -1867,21 +1733,7 @@
         <w:rPr>
           <w:color w:val="000000"/>
         </w:rPr>
-        <w:t xml:space="preserve">Ensure that </w:t>
-      </w:r>
-      <w:proofErr w:type="spellStart"/>
-      <w:r>
-        <w:rPr>
-          <w:color w:val="000000"/>
-        </w:rPr>
-        <w:t>soccerbot</w:t>
-      </w:r>
-      <w:proofErr w:type="spellEnd"/>
-      <w:r>
-        <w:rPr>
-          <w:color w:val="000000"/>
-        </w:rPr>
-        <w:t xml:space="preserve"> works</w:t>
+        <w:t>Ensure that soccerbot works</w:t>
       </w:r>
     </w:p>
     <w:p>
@@ -1903,21 +1755,7 @@
         <w:rPr>
           <w:color w:val="000000"/>
         </w:rPr>
-        <w:t xml:space="preserve">Ensure </w:t>
-      </w:r>
-      <w:proofErr w:type="spellStart"/>
-      <w:r>
-        <w:rPr>
-          <w:color w:val="000000"/>
-        </w:rPr>
-        <w:t>soccerbot</w:t>
-      </w:r>
-      <w:proofErr w:type="spellEnd"/>
-      <w:r>
-        <w:rPr>
-          <w:color w:val="000000"/>
-        </w:rPr>
-        <w:t xml:space="preserve"> travels straight after it centers the ball in its camera</w:t>
+        <w:t>Ensure soccerbot travels straight after it centers the ball in its camera</w:t>
       </w:r>
     </w:p>
     <w:p>
@@ -1961,21 +1799,7 @@
         <w:rPr>
           <w:color w:val="000000"/>
         </w:rPr>
-        <w:t>`</w:t>
-      </w:r>
-      <w:proofErr w:type="spellStart"/>
-      <w:r>
-        <w:rPr>
-          <w:color w:val="000000"/>
-        </w:rPr>
-        <w:t>sudo</w:t>
-      </w:r>
-      <w:proofErr w:type="spellEnd"/>
-      <w:r>
-        <w:rPr>
-          <w:color w:val="000000"/>
-        </w:rPr>
-        <w:t xml:space="preserve"> nano soccer_bot.py`</w:t>
+        <w:t>`sudo nano soccer_bot.py`</w:t>
       </w:r>
     </w:p>
     <w:p>
@@ -1997,35 +1821,7 @@
         <w:rPr>
           <w:color w:val="000000"/>
         </w:rPr>
-        <w:t>`</w:t>
-      </w:r>
-      <w:proofErr w:type="spellStart"/>
-      <w:r>
-        <w:rPr>
-          <w:color w:val="000000"/>
-        </w:rPr>
-        <w:t>sudo</w:t>
-      </w:r>
-      <w:proofErr w:type="spellEnd"/>
-      <w:r>
-        <w:rPr>
-          <w:color w:val="000000"/>
-        </w:rPr>
-        <w:t xml:space="preserve"> </w:t>
-      </w:r>
-      <w:proofErr w:type="spellStart"/>
-      <w:r>
-        <w:rPr>
-          <w:color w:val="000000"/>
-        </w:rPr>
-        <w:t>thonny</w:t>
-      </w:r>
-      <w:proofErr w:type="spellEnd"/>
-      <w:r>
-        <w:rPr>
-          <w:color w:val="000000"/>
-        </w:rPr>
-        <w:t xml:space="preserve"> soccer_bot.py`</w:t>
+        <w:t>`sudo thonny soccer_bot.py`</w:t>
       </w:r>
     </w:p>
     <w:p>

</xml_diff>